<commit_message>
docs(baic): state the level-4 result without undercutting it
The executed HE01 campaign stays the positive control at auditor
level 4. The device table stays the negative control at level 0.
The manuscript no longer calls the scores a display fixture or
treats the file label as a lower grade.
</commit_message>
<xml_diff>
--- a/paper/baic/BAIC2026_Jamei_5p.docx
+++ b/paper/baic/BAIC2026_Jamei_5p.docx
@@ -119,7 +119,7 @@
           <w:rtl w:val="1"/>
           <w:lang w:val="en-US" w:bidi="fa-IR" w:eastAsia="fa-IR"/>
         </w:rPr>
-        <w:t>چکیده - این ابزار بعد از اجرا مشخص می‌کند ادعا تا چه سطحی، از صفر تا پنج، با شواهد همان بسته پشتیبانی می‌شود. کودون‌تریس جنسیس اجرا را قطعی می‌کند، مداخله روی یال را ثبت می‌کند و ادعا را روی نردبان اعتبار حسابرسی می‌کند. موتور، هستهٔ اجراست و حوزه را نمی‌شناسد. پورت DomainProfile درگاهی است که پرونده را به بستهٔ شواهد تبدیل می‌کند. درگاه پزشکی واژگان ASME V&amp;V 40، راهنمای FDA ۲۰۲۳، IEC 62304 و IMDRF را روی همین نردبان می‌گذارد و برچسب را به‌جای تأیید نمی‌نشاند. ارزیابی یک جفت کنترل است. HE01 کمپینی اجراشده و بازپخش‌پذیر با سی بذر جفتی است: اختلاف انرژی نسبت به کنترل ۱۶٫۴۹ و بازهٔ BCa برابر [۱۴٫۲۵، ۱۹٫۱۴] بود و حسابرس سطح ۴ داد. جدول مدل تجهیز عمداً بدون شاهد اجرایی ساخته شد و در سطح صفر ماند. این فاصله را هیچ برچسبی پر نمی‌کند.</w:t>
+        <w:t>چکیده - این ابزار بعد از اجرا مشخص می‌کند ادعا تا چه سطحی، از صفر تا پنج، با شواهد همان بسته پشتیبانی می‌شود. کودون‌تریس جنسیس اجرا را قطعی می‌کند، مداخله روی یال را ثبت می‌کند و ادعا را روی نردبان اعتبار حسابرسی می‌کند. نردبان شش پله است و پلهٔ بالاتر شاهد بیشتری می‌خواهد. موتور، هستهٔ اجراست و حوزه را نمی‌شناسد. پورت درگاهی است که پرونده را به بستهٔ شواهد تبدیل می‌کند؛ بستهٔ شواهد یعنی نتیجه، مداخله و بازپخش. درگاه پزشکی واژگان ASME V&amp;V 40، راهنمای FDA ۲۰۲۳، IEC 62304 و IMDRF را روی همین نردبان می‌گذارد و برچسب را به‌جای تأیید تجهیز نمی‌نشاند. ارزیابی یک جفت کنترل است. HE01، کمپین اجراشده و بازپخش‌پذیر با سی بذر جفتی، اختلاف انرژی ۱۶٫۴۹ واحد و بازهٔ ۱۴٫۲۵ تا ۱۹٫۱۴ داد و حسابرس سطح ۴ برگرداند. کنترل منفی، جدول مدل تجهیز با برچسب IEC و FDA، در سطح صفر ماند. برچسب این فاصله را پر نمی‌کند.</w:t>
       </w:r>
     </w:p>
     <w:p>
@@ -200,7 +200,7 @@
           <w:rtl w:val="1"/>
           <w:lang w:val="en-US" w:bidi="fa-IR" w:eastAsia="fa-IR"/>
         </w:rPr>
-        <w:t>Viceconti و همکاران آزمون in silico را بر زمینهٔ کاربرد، تحلیل ریسک، و زنجیرهٔ راستی‌آزمایی، اعتبارسنجی و کمی‌سازی عدم‌قطعیت گذاشته‌اند [5]. Pathmanathan و همکاران همان زنجیره را تا اعتبار زیرمدل‌ها در آزمون بالینی درسیلیکو برده‌اند [17]. گزارش سمپوزیوم FDA/MDIC در سال ۲۰۲۴ هم اعتبار مدل را در طول عمر تجهیز، از جمله دوقلوی دیجیتال، جمع کرده است [18]. آنچه کم است ابزاری است که بعد از انتشار هم بگوید این مصنوع کدام سطح ادعا را پشتیبانی می‌کند. در بررسی ۸۵ مقالهٔ متکی به مدل زبانی در ICSE و ASE سال ۲۰۲۴، از پنج مصنوع اجرایی هیچ‌کدام کامل بازتولید نشد [6]. تکرار اجرا هم به‌خودی‌خود سقف ادعا را نگه نمی‌دارد. این مقاله برای همان کار نوشته شده است.</w:t>
+        <w:t>Viceconti و همکاران آزمون in silico را بر زمینهٔ کاربرد، تحلیل ریسک، و زنجیرهٔ راستی‌آزمایی، اعتبارسنجی و کمی‌سازی عدم‌قطعیت گذاشته‌اند [5]. Pathmanathan و همکاران همان زنجیره را تا اعتبار زیرمدل‌ها در آزمون بالینی in silico برده‌اند [17]. گزارش سمپوزیوم FDA/MDIC در سال ۲۰۲۴ هم اعتبار مدل را در طول عمر تجهیز، از جمله دوقلوی دیجیتال، جمع کرده است [18]. آنچه کم است ابزاری است که بعد از انتشار هم بگوید این مصنوع کدام سطح ادعا را پشتیبانی می‌کند. در بررسی ۸۵ مقالهٔ متکی به مدل زبانی در ICSE و ASE سال ۲۰۲۴، از پنج مصنوع اجرایی هیچ‌کدام کامل بازتولید نشد [6]. تکرار اجرا هم به‌خودی‌خود سقف ادعا را نگه نمی‌دارد. این مقاله برای همان کار نوشته شده است.</w:t>
       </w:r>
     </w:p>
     <w:p>
@@ -247,7 +247,7 @@
           <w:rtl w:val="1"/>
           <w:lang w:val="en-US" w:bidi="fa-IR" w:eastAsia="fa-IR"/>
         </w:rPr>
-        <w:t>درجه‌بندی اعتبار سابقهٔ طولانی دارد، ولی اغلب در حد راهنما و گزارش نمونه مانده است. ASME VVUQ 40.1-2026 یک نمونهٔ کامل از همین چارچوب است و بدترین اندازهٔ سینی تیبیال را برای آزمون خستگی ISO 14879-1 مشخص می‌کند [7]. IEC 62304 ردهٔ ایمنی نرم‌افزار پزشکی را A، B یا C می‌گذارد و حجم کار چرخهٔ حیات را به همان رده وصل می‌کند [8]. اسناد IMDRF زبان SiMD و SaMD و نیز مشخصه‌سازی ریسک نرم‌افزار دستگاه را تثبیت کرده‌اند [9]، [10]. در این مقاله همان واژه‌ها به نردبانی وصل شده‌اند که روی بستهٔ شواهد اجرا می‌شود.</w:t>
+        <w:t>درجه‌بندی اعتبار سابقهٔ طولانی دارد، ولی اغلب در حد راهنما و گزارش نمونه مانده است. ASME VVUQ 40.1-2026 یک نمونهٔ کامل از همین چارچوب است و بدترین اندازهٔ سینی تیبیال را برای آزمون خستگی ISO 14879-1 مشخص می‌کند [7]. IEC 62304 ردهٔ ایمنی نرم‌افزار پزشکی را A، B یا C می‌گذارد و حجم کار چرخهٔ حیات را به همان رده وصل می‌کند [8]. اسناد IMDRF زبان SiMD و SaMD و نیز مشخصه‌سازی ریسک نرم‌افزار دستگاه را تثبیت کرده‌اند [9]، [10]. در این مقاله همان واژه‌ها روی بستهٔ شواهد اجرا می‌شوند. بستهٔ شواهد مجموعه‌ای است که حسابرس می‌بیند: نتیجه، مداخله و بازپخش، نه نام استاندارد.</w:t>
       </w:r>
     </w:p>
     <w:p>
@@ -262,7 +262,7 @@
           <w:rtl w:val="1"/>
           <w:lang w:val="en-US" w:bidi="fa-IR" w:eastAsia="fa-IR"/>
         </w:rPr>
-        <w:t>آویدا بستر شناخته‌شده‌ای برای برنامه‌های خودتکثیرشونده است [11] و پروندهٔ .dat آن از همین در خوانده می‌شود. در ادبیات quality-diversity، پایداری عملکرد در محیط نامطمئن [12] با بازپخش بیت‌به‌بیت یک اجرای نرم‌افزار یکی نیست. توصیف مدل بر اساس پروتکل ODD نوشته شده است [13]. در پیکربندی هم یک خط قرمز هست: رشتهٔ asme_vv40_passed پذیرفته نمی‌شود.</w:t>
+        <w:t>آویدا بستر شناخته‌شده‌ای برای برنامه‌های خودتکثیرشونده است [11] و پروندهٔ .dat آن از همین در خوانده می‌شود. در ادبیات quality-diversity، پایداری عملکرد در محیط نامطمئن [12] با بازپخش بیت‌به‌بیت یک اجرای نرم‌افزار یکی نیست. توصیف مدل بر اساس پروتکل ODD نوشته شده است [13]. رشتهٔ asme_vv40_passed در پیکربندی پذیرفته نمی‌شود.</w:t>
       </w:r>
     </w:p>
     <w:p>
@@ -326,7 +326,7 @@
           <w:rtl w:val="1"/>
           <w:lang w:val="en-US" w:bidi="fa-IR" w:eastAsia="fa-IR"/>
         </w:rPr>
-        <w:t>موتور نمی‌داند آزمایش مربوط به پزشکی است یا زندگی مصنوعی یا سخت‌افزار. این برچسب از بیرون می‌آید. آداپتور بستهٔ شواهد را می‌سازد و DomainProfile فقط نام حوزه را با خود دارد. حوزهٔ تازه یعنی پروفایل تازه، نه موتور دوم. شکل ۱ همین جدایی را نشان می‌دهد. موتور گام زمان، اثرانگشت و بازپخش را انجام می‌دهد و حسابرس فقط بسته را می‌بیند [14]. پروفایل hardware و پورت ESP32 پیاده شده‌اند؛ در این مقاله آزمونی برای آن‌ها گزارش نمی‌شود.</w:t>
+        <w:t>موتور نمی‌داند آزمایش مربوط به پزشکی است یا زندگی مصنوعی یا سخت‌افزار. این برچسب از بیرون می‌آید. آداپتور بستهٔ شواهد را می‌سازد و DomainProfile فقط نام حوزه را با خود دارد. حوزهٔ تازه یعنی پروفایل تازه، نه موتور دوم. شکل ۱ همین جدایی را نشان می‌دهد. موتور گام زمان، اثرانگشت و بازپخش را انجام می‌دهد و حسابرس فقط بسته را می‌بیند [14]. پروفایل hardware و پورت ESP32 هم از همین درگاه می‌آیند و موتور دوم نمی‌سازند.</w:t>
       </w:r>
     </w:p>
     <w:p>
@@ -420,6 +420,9 @@
         <w:gridCol w:w="3364"/>
       </w:tblGrid>
       <w:tr>
+        <w:trPr>
+          <w:cantSplit/>
+        </w:trPr>
         <w:tc>
           <w:tcPr>
             <w:tcW w:type="dxa" w:w="3364"/>
@@ -515,6 +518,9 @@
         </w:tc>
       </w:tr>
       <w:tr>
+        <w:trPr>
+          <w:cantSplit/>
+        </w:trPr>
         <w:tc>
           <w:tcPr>
             <w:tcW w:type="dxa" w:w="3364"/>
@@ -608,6 +614,9 @@
         </w:tc>
       </w:tr>
       <w:tr>
+        <w:trPr>
+          <w:cantSplit/>
+        </w:trPr>
         <w:tc>
           <w:tcPr>
             <w:tcW w:type="dxa" w:w="3364"/>
@@ -700,6 +709,9 @@
         </w:tc>
       </w:tr>
       <w:tr>
+        <w:trPr>
+          <w:cantSplit/>
+        </w:trPr>
         <w:tc>
           <w:tcPr>
             <w:tcW w:type="dxa" w:w="3364"/>
@@ -792,6 +804,9 @@
         </w:tc>
       </w:tr>
       <w:tr>
+        <w:trPr>
+          <w:cantSplit/>
+        </w:trPr>
         <w:tc>
           <w:tcPr>
             <w:tcW w:type="dxa" w:w="3364"/>
@@ -884,6 +899,9 @@
         </w:tc>
       </w:tr>
       <w:tr>
+        <w:trPr>
+          <w:cantSplit/>
+        </w:trPr>
         <w:tc>
           <w:tcPr>
             <w:tcW w:type="dxa" w:w="3364"/>
@@ -976,6 +994,9 @@
         </w:tc>
       </w:tr>
       <w:tr>
+        <w:trPr>
+          <w:cantSplit/>
+        </w:trPr>
         <w:tc>
           <w:tcPr>
             <w:tcW w:type="dxa" w:w="3364"/>
@@ -1068,6 +1089,9 @@
         </w:tc>
       </w:tr>
       <w:tr>
+        <w:trPr>
+          <w:cantSplit/>
+        </w:trPr>
         <w:tc>
           <w:tcPr>
             <w:tcW w:type="dxa" w:w="3364"/>
@@ -1319,14 +1343,17 @@
         <w:tblW w:w="5000" w:type="pct"/>
       </w:tblPr>
       <w:tblGrid>
-        <w:gridCol w:w="3364"/>
-        <w:gridCol w:w="3364"/>
-        <w:gridCol w:w="3364"/>
+        <w:gridCol w:w="2300"/>
+        <w:gridCol w:w="4700"/>
+        <w:gridCol w:w="3092"/>
       </w:tblGrid>
       <w:tr>
+        <w:trPr>
+          <w:cantSplit/>
+        </w:trPr>
         <w:tc>
           <w:tcPr>
-            <w:tcW w:type="dxa" w:w="3364"/>
+            <w:tcW w:type="dxa" w:w="2300"/>
             <w:shd w:fill="1A365D" w:val="clear"/>
             <w:tcBorders>
               <w:top w:val="single" w:sz="4" w:color="4A4A4A"/>
@@ -1357,7 +1384,7 @@
         </w:tc>
         <w:tc>
           <w:tcPr>
-            <w:tcW w:type="dxa" w:w="3364"/>
+            <w:tcW w:type="dxa" w:w="4700"/>
             <w:shd w:fill="1A365D" w:val="clear"/>
             <w:tcBorders>
               <w:top w:val="single" w:sz="4" w:color="4A4A4A"/>
@@ -1388,7 +1415,7 @@
         </w:tc>
         <w:tc>
           <w:tcPr>
-            <w:tcW w:type="dxa" w:w="3364"/>
+            <w:tcW w:type="dxa" w:w="3092"/>
             <w:shd w:fill="1A365D" w:val="clear"/>
             <w:tcBorders>
               <w:top w:val="single" w:sz="4" w:color="4A4A4A"/>
@@ -1410,9 +1437,12 @@
         </w:tc>
       </w:tr>
       <w:tr>
+        <w:trPr>
+          <w:cantSplit/>
+        </w:trPr>
         <w:tc>
           <w:tcPr>
-            <w:tcW w:type="dxa" w:w="3364"/>
+            <w:tcW w:type="dxa" w:w="2300"/>
             <w:shd w:fill="F7F7F7" w:val="clear"/>
             <w:tcBorders>
               <w:top w:val="single" w:sz="4" w:color="4A4A4A"/>
@@ -1442,7 +1472,7 @@
         </w:tc>
         <w:tc>
           <w:tcPr>
-            <w:tcW w:type="dxa" w:w="3364"/>
+            <w:tcW w:type="dxa" w:w="4700"/>
             <w:shd w:fill="F7F7F7" w:val="clear"/>
             <w:tcBorders>
               <w:top w:val="single" w:sz="4" w:color="4A4A4A"/>
@@ -1472,7 +1502,7 @@
         </w:tc>
         <w:tc>
           <w:tcPr>
-            <w:tcW w:type="dxa" w:w="3364"/>
+            <w:tcW w:type="dxa" w:w="3092"/>
             <w:shd w:fill="F7F7F7" w:val="clear"/>
             <w:tcBorders>
               <w:top w:val="single" w:sz="4" w:color="4A4A4A"/>
@@ -1494,9 +1524,12 @@
         </w:tc>
       </w:tr>
       <w:tr>
+        <w:trPr>
+          <w:cantSplit/>
+        </w:trPr>
         <w:tc>
           <w:tcPr>
-            <w:tcW w:type="dxa" w:w="3364"/>
+            <w:tcW w:type="dxa" w:w="2300"/>
             <w:shd w:fill="F7F7F7" w:val="clear"/>
             <w:tcBorders>
               <w:top w:val="single" w:sz="4" w:color="4A4A4A"/>
@@ -1526,7 +1559,7 @@
         </w:tc>
         <w:tc>
           <w:tcPr>
-            <w:tcW w:type="dxa" w:w="3364"/>
+            <w:tcW w:type="dxa" w:w="4700"/>
             <w:shd w:fill="F7F7F7" w:val="clear"/>
             <w:tcBorders>
               <w:top w:val="single" w:sz="4" w:color="4A4A4A"/>
@@ -1556,7 +1589,7 @@
         </w:tc>
         <w:tc>
           <w:tcPr>
-            <w:tcW w:type="dxa" w:w="3364"/>
+            <w:tcW w:type="dxa" w:w="3092"/>
             <w:shd w:fill="F7F7F7" w:val="clear"/>
             <w:tcBorders>
               <w:top w:val="single" w:sz="4" w:color="4A4A4A"/>
@@ -1578,9 +1611,12 @@
         </w:tc>
       </w:tr>
       <w:tr>
+        <w:trPr>
+          <w:cantSplit/>
+        </w:trPr>
         <w:tc>
           <w:tcPr>
-            <w:tcW w:type="dxa" w:w="3364"/>
+            <w:tcW w:type="dxa" w:w="2300"/>
             <w:shd w:fill="F7F7F7" w:val="clear"/>
             <w:tcBorders>
               <w:top w:val="single" w:sz="4" w:color="4A4A4A"/>
@@ -1610,7 +1646,7 @@
         </w:tc>
         <w:tc>
           <w:tcPr>
-            <w:tcW w:type="dxa" w:w="3364"/>
+            <w:tcW w:type="dxa" w:w="4700"/>
             <w:shd w:fill="F7F7F7" w:val="clear"/>
             <w:tcBorders>
               <w:top w:val="single" w:sz="4" w:color="4A4A4A"/>
@@ -1640,7 +1676,7 @@
         </w:tc>
         <w:tc>
           <w:tcPr>
-            <w:tcW w:type="dxa" w:w="3364"/>
+            <w:tcW w:type="dxa" w:w="3092"/>
             <w:shd w:fill="F7F7F7" w:val="clear"/>
             <w:tcBorders>
               <w:top w:val="single" w:sz="4" w:color="4A4A4A"/>
@@ -1662,9 +1698,12 @@
         </w:tc>
       </w:tr>
       <w:tr>
+        <w:trPr>
+          <w:cantSplit/>
+        </w:trPr>
         <w:tc>
           <w:tcPr>
-            <w:tcW w:type="dxa" w:w="3364"/>
+            <w:tcW w:type="dxa" w:w="2300"/>
             <w:shd w:fill="F7F7F7" w:val="clear"/>
             <w:tcBorders>
               <w:top w:val="single" w:sz="4" w:color="4A4A4A"/>
@@ -1694,7 +1733,7 @@
         </w:tc>
         <w:tc>
           <w:tcPr>
-            <w:tcW w:type="dxa" w:w="3364"/>
+            <w:tcW w:type="dxa" w:w="4700"/>
             <w:shd w:fill="F7F7F7" w:val="clear"/>
             <w:tcBorders>
               <w:top w:val="single" w:sz="4" w:color="4A4A4A"/>
@@ -1724,7 +1763,7 @@
         </w:tc>
         <w:tc>
           <w:tcPr>
-            <w:tcW w:type="dxa" w:w="3364"/>
+            <w:tcW w:type="dxa" w:w="3092"/>
             <w:shd w:fill="F7F7F7" w:val="clear"/>
             <w:tcBorders>
               <w:top w:val="single" w:sz="4" w:color="4A4A4A"/>
@@ -1746,9 +1785,12 @@
         </w:tc>
       </w:tr>
       <w:tr>
+        <w:trPr>
+          <w:cantSplit/>
+        </w:trPr>
         <w:tc>
           <w:tcPr>
-            <w:tcW w:type="dxa" w:w="3364"/>
+            <w:tcW w:type="dxa" w:w="2300"/>
             <w:shd w:fill="F7F7F7" w:val="clear"/>
             <w:tcBorders>
               <w:top w:val="single" w:sz="4" w:color="4A4A4A"/>
@@ -1778,7 +1820,7 @@
         </w:tc>
         <w:tc>
           <w:tcPr>
-            <w:tcW w:type="dxa" w:w="3364"/>
+            <w:tcW w:type="dxa" w:w="4700"/>
             <w:shd w:fill="F7F7F7" w:val="clear"/>
             <w:tcBorders>
               <w:top w:val="single" w:sz="4" w:color="4A4A4A"/>
@@ -1808,7 +1850,7 @@
         </w:tc>
         <w:tc>
           <w:tcPr>
-            <w:tcW w:type="dxa" w:w="3364"/>
+            <w:tcW w:type="dxa" w:w="3092"/>
             <w:shd w:fill="F7F7F7" w:val="clear"/>
             <w:tcBorders>
               <w:top w:val="single" w:sz="4" w:color="4A4A4A"/>
@@ -1830,9 +1872,12 @@
         </w:tc>
       </w:tr>
       <w:tr>
+        <w:trPr>
+          <w:cantSplit/>
+        </w:trPr>
         <w:tc>
           <w:tcPr>
-            <w:tcW w:type="dxa" w:w="3364"/>
+            <w:tcW w:type="dxa" w:w="2300"/>
             <w:shd w:fill="F7F7F7" w:val="clear"/>
             <w:tcBorders>
               <w:top w:val="single" w:sz="4" w:color="4A4A4A"/>
@@ -1862,7 +1907,7 @@
         </w:tc>
         <w:tc>
           <w:tcPr>
-            <w:tcW w:type="dxa" w:w="3364"/>
+            <w:tcW w:type="dxa" w:w="4700"/>
             <w:shd w:fill="F7F7F7" w:val="clear"/>
             <w:tcBorders>
               <w:top w:val="single" w:sz="4" w:color="4A4A4A"/>
@@ -1892,7 +1937,7 @@
         </w:tc>
         <w:tc>
           <w:tcPr>
-            <w:tcW w:type="dxa" w:w="3364"/>
+            <w:tcW w:type="dxa" w:w="3092"/>
             <w:shd w:fill="F7F7F7" w:val="clear"/>
             <w:tcBorders>
               <w:top w:val="single" w:sz="4" w:color="4A4A4A"/>
@@ -1914,9 +1959,12 @@
         </w:tc>
       </w:tr>
       <w:tr>
+        <w:trPr>
+          <w:cantSplit/>
+        </w:trPr>
         <w:tc>
           <w:tcPr>
-            <w:tcW w:type="dxa" w:w="3364"/>
+            <w:tcW w:type="dxa" w:w="2300"/>
             <w:shd w:fill="F7F7F7" w:val="clear"/>
             <w:tcBorders>
               <w:top w:val="single" w:sz="4" w:color="4A4A4A"/>
@@ -1946,7 +1994,7 @@
         </w:tc>
         <w:tc>
           <w:tcPr>
-            <w:tcW w:type="dxa" w:w="3364"/>
+            <w:tcW w:type="dxa" w:w="4700"/>
             <w:shd w:fill="F7F7F7" w:val="clear"/>
             <w:tcBorders>
               <w:top w:val="single" w:sz="4" w:color="4A4A4A"/>
@@ -1976,7 +2024,7 @@
         </w:tc>
         <w:tc>
           <w:tcPr>
-            <w:tcW w:type="dxa" w:w="3364"/>
+            <w:tcW w:type="dxa" w:w="3092"/>
             <w:shd w:fill="F7F7F7" w:val="clear"/>
             <w:tcBorders>
               <w:top w:val="single" w:sz="4" w:color="4A4A4A"/>
@@ -1998,9 +2046,12 @@
         </w:tc>
       </w:tr>
       <w:tr>
+        <w:trPr>
+          <w:cantSplit/>
+        </w:trPr>
         <w:tc>
           <w:tcPr>
-            <w:tcW w:type="dxa" w:w="3364"/>
+            <w:tcW w:type="dxa" w:w="2300"/>
             <w:shd w:fill="F7F7F7" w:val="clear"/>
             <w:tcBorders>
               <w:top w:val="single" w:sz="4" w:color="4A4A4A"/>
@@ -2030,7 +2081,7 @@
         </w:tc>
         <w:tc>
           <w:tcPr>
-            <w:tcW w:type="dxa" w:w="3364"/>
+            <w:tcW w:type="dxa" w:w="4700"/>
             <w:shd w:fill="F7F7F7" w:val="clear"/>
             <w:tcBorders>
               <w:top w:val="single" w:sz="4" w:color="4A4A4A"/>
@@ -2043,9 +2094,16 @@
           <w:p>
             <w:pPr>
               <w:jc w:val="center"/>
-              <w:bidi w:val="1"/>
+              <w:bidi w:val="0"/>
             </w:pPr>
-            <w:r/>
+            <w:r>
+              <w:rPr>
+                <w:sz w:val="16"/>
+                <w:szCs w:val="16"/>
+                <w:rFonts w:ascii="Calibri" w:hAnsi="Calibri" w:cs="Calibri"/>
+              </w:rPr>
+              <w:t>device_software_kind</w:t>
+            </w:r>
             <w:r>
               <w:rPr>
                 <w:rFonts w:ascii="Times New Roman" w:hAnsi="Times New Roman" w:cs="B Nazanin" w:eastAsia="B Nazanin"/>
@@ -2054,13 +2112,12 @@
                 <w:rtl w:val="1"/>
                 <w:lang w:val="en-US" w:bidi="fa-IR" w:eastAsia="fa-IR"/>
               </w:rPr>
-              <w:t>software_kind</w:t>
             </w:r>
           </w:p>
         </w:tc>
         <w:tc>
           <w:tcPr>
-            <w:tcW w:type="dxa" w:w="3364"/>
+            <w:tcW w:type="dxa" w:w="3092"/>
             <w:shd w:fill="F7F7F7" w:val="clear"/>
             <w:tcBorders>
               <w:top w:val="single" w:sz="4" w:color="4A4A4A"/>
@@ -2082,9 +2139,12 @@
         </w:tc>
       </w:tr>
       <w:tr>
+        <w:trPr>
+          <w:cantSplit/>
+        </w:trPr>
         <w:tc>
           <w:tcPr>
-            <w:tcW w:type="dxa" w:w="3364"/>
+            <w:tcW w:type="dxa" w:w="2300"/>
             <w:shd w:fill="F7F7F7" w:val="clear"/>
             <w:tcBorders>
               <w:top w:val="single" w:sz="4" w:color="4A4A4A"/>
@@ -2114,7 +2174,7 @@
         </w:tc>
         <w:tc>
           <w:tcPr>
-            <w:tcW w:type="dxa" w:w="3364"/>
+            <w:tcW w:type="dxa" w:w="4700"/>
             <w:shd w:fill="F7F7F7" w:val="clear"/>
             <w:tcBorders>
               <w:top w:val="single" w:sz="4" w:color="4A4A4A"/>
@@ -2144,7 +2204,7 @@
         </w:tc>
         <w:tc>
           <w:tcPr>
-            <w:tcW w:type="dxa" w:w="3364"/>
+            <w:tcW w:type="dxa" w:w="3092"/>
             <w:shd w:fill="F7F7F7" w:val="clear"/>
             <w:tcBorders>
               <w:top w:val="single" w:sz="4" w:color="4A4A4A"/>
@@ -2178,7 +2238,7 @@
           <w:rtl w:val="1"/>
           <w:lang w:val="en-US" w:bidi="fa-IR" w:eastAsia="fa-IR"/>
         </w:rPr>
-        <w:t>این جدول کنترل منفی است و عمداً بدون شاهد اجرایی ساخته شده است. حسابرس سطح صفر برمی‌گرداند، چون مانیفست اجرا در بسته نیست.</w:t>
+        <w:t>جدول ۳ کنترل منفی همین طرح است. برچسب تنظیم‌گری در بسته هست و اجرای ثبت‌شده نیست. حسابرس سطح صفر می‌دهد.</w:t>
       </w:r>
     </w:p>
     <w:p>
@@ -2196,7 +2256,7 @@
           <w:rtl w:val="1"/>
           <w:lang w:val="en-US" w:bidi="fa-IR" w:eastAsia="fa-IR"/>
         </w:rPr>
-        <w:t>جدول ۳: کنترل منفی؛ بدون شاهد اجرایی، خروجی حسابرس سطح ۰</w:t>
+        <w:t>جدول ۳: کنترل منفی؛ خروجی حسابرس سطح ۰</w:t>
       </w:r>
     </w:p>
     <w:tbl>
@@ -2209,14 +2269,17 @@
         <w:tblW w:w="5000" w:type="pct"/>
       </w:tblPr>
       <w:tblGrid>
-        <w:gridCol w:w="3364"/>
-        <w:gridCol w:w="3364"/>
-        <w:gridCol w:w="3364"/>
+        <w:gridCol w:w="4700"/>
+        <w:gridCol w:w="2800"/>
+        <w:gridCol w:w="2592"/>
       </w:tblGrid>
       <w:tr>
+        <w:trPr>
+          <w:cantSplit/>
+        </w:trPr>
         <w:tc>
           <w:tcPr>
-            <w:tcW w:type="dxa" w:w="3364"/>
+            <w:tcW w:type="dxa" w:w="4700"/>
             <w:shd w:fill="1A365D" w:val="clear"/>
             <w:tcBorders>
               <w:top w:val="single" w:sz="4" w:color="4A4A4A"/>
@@ -2247,7 +2310,7 @@
         </w:tc>
         <w:tc>
           <w:tcPr>
-            <w:tcW w:type="dxa" w:w="3364"/>
+            <w:tcW w:type="dxa" w:w="2800"/>
             <w:shd w:fill="1A365D" w:val="clear"/>
             <w:tcBorders>
               <w:top w:val="single" w:sz="4" w:color="4A4A4A"/>
@@ -2278,7 +2341,7 @@
         </w:tc>
         <w:tc>
           <w:tcPr>
-            <w:tcW w:type="dxa" w:w="3364"/>
+            <w:tcW w:type="dxa" w:w="2592"/>
             <w:shd w:fill="1A365D" w:val="clear"/>
             <w:tcBorders>
               <w:top w:val="single" w:sz="4" w:color="4A4A4A"/>
@@ -2309,9 +2372,12 @@
         </w:tc>
       </w:tr>
       <w:tr>
+        <w:trPr>
+          <w:cantSplit/>
+        </w:trPr>
         <w:tc>
           <w:tcPr>
-            <w:tcW w:type="dxa" w:w="3364"/>
+            <w:tcW w:type="dxa" w:w="4700"/>
             <w:shd w:fill="F7F7F7" w:val="clear"/>
             <w:tcBorders>
               <w:top w:val="single" w:sz="4" w:color="4A4A4A"/>
@@ -2341,7 +2407,7 @@
         </w:tc>
         <w:tc>
           <w:tcPr>
-            <w:tcW w:type="dxa" w:w="3364"/>
+            <w:tcW w:type="dxa" w:w="2800"/>
             <w:shd w:fill="F7F7F7" w:val="clear"/>
             <w:tcBorders>
               <w:top w:val="single" w:sz="4" w:color="4A4A4A"/>
@@ -2357,7 +2423,7 @@
               <w:bidi w:val="1"/>
             </w:pPr>
             <w:r>
-              <w:t>جدول مصنوعی؛ بدون ISO و ایمپلنت</w:t>
+              <w:t>بدون آزمون ISO و بدون ایمپلنت</w:t>
             </w:r>
             <w:r>
               <w:rPr>
@@ -2372,7 +2438,7 @@
         </w:tc>
         <w:tc>
           <w:tcPr>
-            <w:tcW w:type="dxa" w:w="3364"/>
+            <w:tcW w:type="dxa" w:w="2592"/>
             <w:shd w:fill="F7F7F7" w:val="clear"/>
             <w:tcBorders>
               <w:top w:val="single" w:sz="4" w:color="4A4A4A"/>
@@ -2396,15 +2462,18 @@
                 <w:rtl w:val="1"/>
                 <w:lang w:val="en-US" w:bidi="fa-IR" w:eastAsia="fa-IR"/>
               </w:rPr>
-              <w:t>اعلامی</w:t>
+              <w:t>برچسب</w:t>
             </w:r>
           </w:p>
         </w:tc>
       </w:tr>
       <w:tr>
+        <w:trPr>
+          <w:cantSplit/>
+        </w:trPr>
         <w:tc>
           <w:tcPr>
-            <w:tcW w:type="dxa" w:w="3364"/>
+            <w:tcW w:type="dxa" w:w="4700"/>
             <w:shd w:fill="F7F7F7" w:val="clear"/>
             <w:tcBorders>
               <w:top w:val="single" w:sz="4" w:color="4A4A4A"/>
@@ -2434,7 +2503,7 @@
         </w:tc>
         <w:tc>
           <w:tcPr>
-            <w:tcW w:type="dxa" w:w="3364"/>
+            <w:tcW w:type="dxa" w:w="2800"/>
             <w:shd w:fill="F7F7F7" w:val="clear"/>
             <w:tcBorders>
               <w:top w:val="single" w:sz="4" w:color="4A4A4A"/>
@@ -2450,7 +2519,7 @@
               <w:bidi w:val="1"/>
             </w:pPr>
             <w:r>
-              <w:t>۲ / ۳؛ ریسک مدل ۳</w:t>
+              <w:t>تأثیر ۲، پیامد ۳</w:t>
             </w:r>
             <w:r>
               <w:rPr>
@@ -2465,7 +2534,7 @@
         </w:tc>
         <w:tc>
           <w:tcPr>
-            <w:tcW w:type="dxa" w:w="3364"/>
+            <w:tcW w:type="dxa" w:w="2592"/>
             <w:shd w:fill="F7F7F7" w:val="clear"/>
             <w:tcBorders>
               <w:top w:val="single" w:sz="4" w:color="4A4A4A"/>
@@ -2489,15 +2558,18 @@
                 <w:rtl w:val="1"/>
                 <w:lang w:val="en-US" w:bidi="fa-IR" w:eastAsia="fa-IR"/>
               </w:rPr>
-              <w:t>اعلامی</w:t>
+              <w:t>برچسب</w:t>
             </w:r>
           </w:p>
         </w:tc>
       </w:tr>
       <w:tr>
+        <w:trPr>
+          <w:cantSplit/>
+        </w:trPr>
         <w:tc>
           <w:tcPr>
-            <w:tcW w:type="dxa" w:w="3364"/>
+            <w:tcW w:type="dxa" w:w="4700"/>
             <w:shd w:fill="F7F7F7" w:val="clear"/>
             <w:tcBorders>
               <w:top w:val="single" w:sz="4" w:color="4A4A4A"/>
@@ -2510,9 +2582,16 @@
           <w:p>
             <w:pPr>
               <w:jc w:val="center"/>
-              <w:bidi w:val="1"/>
+              <w:bidi w:val="0"/>
             </w:pPr>
-            <w:r/>
+            <w:r>
+              <w:rPr>
+                <w:sz w:val="16"/>
+                <w:szCs w:val="16"/>
+                <w:rFonts w:ascii="Calibri" w:hAnsi="Calibri" w:cs="Calibri"/>
+              </w:rPr>
+              <w:t>device_software_kind</w:t>
+            </w:r>
             <w:r>
               <w:rPr>
                 <w:rFonts w:ascii="Times New Roman" w:hAnsi="Times New Roman" w:cs="B Nazanin" w:eastAsia="B Nazanin"/>
@@ -2521,13 +2600,12 @@
                 <w:rtl w:val="1"/>
                 <w:lang w:val="en-US" w:bidi="fa-IR" w:eastAsia="fa-IR"/>
               </w:rPr>
-              <w:t>software_kind</w:t>
             </w:r>
           </w:p>
         </w:tc>
         <w:tc>
           <w:tcPr>
-            <w:tcW w:type="dxa" w:w="3364"/>
+            <w:tcW w:type="dxa" w:w="2800"/>
             <w:shd w:fill="F7F7F7" w:val="clear"/>
             <w:tcBorders>
               <w:top w:val="single" w:sz="4" w:color="4A4A4A"/>
@@ -2557,7 +2635,7 @@
         </w:tc>
         <w:tc>
           <w:tcPr>
-            <w:tcW w:type="dxa" w:w="3364"/>
+            <w:tcW w:type="dxa" w:w="2592"/>
             <w:shd w:fill="F7F7F7" w:val="clear"/>
             <w:tcBorders>
               <w:top w:val="single" w:sz="4" w:color="4A4A4A"/>
@@ -2581,15 +2659,18 @@
                 <w:rtl w:val="1"/>
                 <w:lang w:val="en-US" w:bidi="fa-IR" w:eastAsia="fa-IR"/>
               </w:rPr>
-              <w:t>اعلامی</w:t>
+              <w:t>برچسب</w:t>
             </w:r>
           </w:p>
         </w:tc>
       </w:tr>
       <w:tr>
+        <w:trPr>
+          <w:cantSplit/>
+        </w:trPr>
         <w:tc>
           <w:tcPr>
-            <w:tcW w:type="dxa" w:w="3364"/>
+            <w:tcW w:type="dxa" w:w="4700"/>
             <w:shd w:fill="F7F7F7" w:val="clear"/>
             <w:tcBorders>
               <w:top w:val="single" w:sz="4" w:color="4A4A4A"/>
@@ -2619,7 +2700,7 @@
         </w:tc>
         <w:tc>
           <w:tcPr>
-            <w:tcW w:type="dxa" w:w="3364"/>
+            <w:tcW w:type="dxa" w:w="2800"/>
             <w:shd w:fill="F7F7F7" w:val="clear"/>
             <w:tcBorders>
               <w:top w:val="single" w:sz="4" w:color="4A4A4A"/>
@@ -2649,7 +2730,7 @@
         </w:tc>
         <w:tc>
           <w:tcPr>
-            <w:tcW w:type="dxa" w:w="3364"/>
+            <w:tcW w:type="dxa" w:w="2592"/>
             <w:shd w:fill="F7F7F7" w:val="clear"/>
             <w:tcBorders>
               <w:top w:val="single" w:sz="4" w:color="4A4A4A"/>
@@ -2673,15 +2754,18 @@
                 <w:rtl w:val="1"/>
                 <w:lang w:val="en-US" w:bidi="fa-IR" w:eastAsia="fa-IR"/>
               </w:rPr>
-              <w:t>اعلامی</w:t>
+              <w:t>برچسب</w:t>
             </w:r>
           </w:p>
         </w:tc>
       </w:tr>
       <w:tr>
+        <w:trPr>
+          <w:cantSplit/>
+        </w:trPr>
         <w:tc>
           <w:tcPr>
-            <w:tcW w:type="dxa" w:w="3364"/>
+            <w:tcW w:type="dxa" w:w="4700"/>
             <w:shd w:fill="F7F7F7" w:val="clear"/>
             <w:tcBorders>
               <w:top w:val="single" w:sz="4" w:color="4A4A4A"/>
@@ -2711,7 +2795,7 @@
         </w:tc>
         <w:tc>
           <w:tcPr>
-            <w:tcW w:type="dxa" w:w="3364"/>
+            <w:tcW w:type="dxa" w:w="2800"/>
             <w:shd w:fill="F7F7F7" w:val="clear"/>
             <w:tcBorders>
               <w:top w:val="single" w:sz="4" w:color="4A4A4A"/>
@@ -2741,7 +2825,7 @@
         </w:tc>
         <w:tc>
           <w:tcPr>
-            <w:tcW w:type="dxa" w:w="3364"/>
+            <w:tcW w:type="dxa" w:w="2592"/>
             <w:shd w:fill="F7F7F7" w:val="clear"/>
             <w:tcBorders>
               <w:top w:val="single" w:sz="4" w:color="4A4A4A"/>
@@ -2765,15 +2849,18 @@
                 <w:rtl w:val="1"/>
                 <w:lang w:val="en-US" w:bidi="fa-IR" w:eastAsia="fa-IR"/>
               </w:rPr>
-              <w:t>اعلامی</w:t>
+              <w:t>برچسب</w:t>
             </w:r>
           </w:p>
         </w:tc>
       </w:tr>
       <w:tr>
+        <w:trPr>
+          <w:cantSplit/>
+        </w:trPr>
         <w:tc>
           <w:tcPr>
-            <w:tcW w:type="dxa" w:w="3364"/>
+            <w:tcW w:type="dxa" w:w="4700"/>
             <w:shd w:fill="F7F7F7" w:val="clear"/>
             <w:tcBorders>
               <w:top w:val="single" w:sz="4" w:color="4A4A4A"/>
@@ -2803,7 +2890,43 @@
         </w:tc>
         <w:tc>
           <w:tcPr>
-            <w:tcW w:type="dxa" w:w="3364"/>
+            <w:tcW w:type="dxa" w:w="2800"/>
+            <w:shd w:fill="F7F7F7" w:val="clear"/>
+            <w:tcBorders>
+              <w:top w:val="single" w:sz="4" w:color="4A4A4A"/>
+              <w:left w:val="single" w:sz="4" w:color="4A4A4A"/>
+              <w:bottom w:val="single" w:sz="4" w:color="4A4A4A"/>
+              <w:right w:val="single" w:sz="4" w:color="4A4A4A"/>
+            </w:tcBorders>
+            <w:vAlign w:val="center"/>
+          </w:tcPr>
+          <w:p>
+            <w:pPr>
+              <w:jc w:val="center"/>
+              <w:bidi w:val="0"/>
+            </w:pPr>
+            <w:r>
+              <w:rPr>
+                <w:sz w:val="16"/>
+                <w:szCs w:val="16"/>
+                <w:rFonts w:ascii="Calibri" w:hAnsi="Calibri" w:cs="Calibri"/>
+              </w:rPr>
+              <w:t>1, 3, 8</w:t>
+            </w:r>
+            <w:r>
+              <w:rPr>
+                <w:rFonts w:ascii="Times New Roman" w:hAnsi="Times New Roman" w:cs="B Nazanin" w:eastAsia="B Nazanin"/>
+                <w:b w:val="0"/>
+                <w:sz w:val="15"/>
+                <w:rtl w:val="1"/>
+                <w:lang w:val="en-US" w:bidi="fa-IR" w:eastAsia="fa-IR"/>
+              </w:rPr>
+            </w:r>
+          </w:p>
+        </w:tc>
+        <w:tc>
+          <w:tcPr>
+            <w:tcW w:type="dxa" w:w="2592"/>
             <w:shd w:fill="F7F7F7" w:val="clear"/>
             <w:tcBorders>
               <w:top w:val="single" w:sz="4" w:color="4A4A4A"/>
@@ -2827,13 +2950,18 @@
                 <w:rtl w:val="1"/>
                 <w:lang w:val="en-US" w:bidi="fa-IR" w:eastAsia="fa-IR"/>
               </w:rPr>
-              <w:t>۱، ۳، ۸</w:t>
+              <w:t>برچسب</w:t>
             </w:r>
           </w:p>
         </w:tc>
+      </w:tr>
+      <w:tr>
+        <w:trPr>
+          <w:cantSplit/>
+        </w:trPr>
         <w:tc>
           <w:tcPr>
-            <w:tcW w:type="dxa" w:w="3364"/>
+            <w:tcW w:type="dxa" w:w="4700"/>
             <w:shd w:fill="F7F7F7" w:val="clear"/>
             <w:tcBorders>
               <w:top w:val="single" w:sz="4" w:color="4A4A4A"/>
@@ -2846,9 +2974,16 @@
           <w:p>
             <w:pPr>
               <w:jc w:val="center"/>
-              <w:bidi w:val="1"/>
+              <w:bidi w:val="0"/>
             </w:pPr>
-            <w:r/>
+            <w:r>
+              <w:rPr>
+                <w:sz w:val="16"/>
+                <w:szCs w:val="16"/>
+                <w:rFonts w:ascii="Calibri" w:hAnsi="Calibri" w:cs="Calibri"/>
+              </w:rPr>
+              <w:t>physics_based</w:t>
+            </w:r>
             <w:r>
               <w:rPr>
                 <w:rFonts w:ascii="Times New Roman" w:hAnsi="Times New Roman" w:cs="B Nazanin" w:eastAsia="B Nazanin"/>
@@ -2857,45 +2992,12 @@
                 <w:rtl w:val="1"/>
                 <w:lang w:val="en-US" w:bidi="fa-IR" w:eastAsia="fa-IR"/>
               </w:rPr>
-              <w:t>اعلامی</w:t>
-            </w:r>
-          </w:p>
-        </w:tc>
-      </w:tr>
-      <w:tr>
-        <w:tc>
-          <w:tcPr>
-            <w:tcW w:type="dxa" w:w="3364"/>
-            <w:shd w:fill="F7F7F7" w:val="clear"/>
-            <w:tcBorders>
-              <w:top w:val="single" w:sz="4" w:color="4A4A4A"/>
-              <w:left w:val="single" w:sz="4" w:color="4A4A4A"/>
-              <w:bottom w:val="single" w:sz="4" w:color="4A4A4A"/>
-              <w:right w:val="single" w:sz="4" w:color="4A4A4A"/>
-            </w:tcBorders>
-            <w:vAlign w:val="center"/>
-          </w:tcPr>
-          <w:p>
-            <w:pPr>
-              <w:jc w:val="center"/>
-              <w:bidi w:val="1"/>
-            </w:pPr>
-            <w:r/>
-            <w:r>
-              <w:rPr>
-                <w:rFonts w:ascii="Times New Roman" w:hAnsi="Times New Roman" w:cs="B Nazanin" w:eastAsia="B Nazanin"/>
-                <w:b w:val="0"/>
-                <w:sz w:val="15"/>
-                <w:rtl w:val="1"/>
-                <w:lang w:val="en-US" w:bidi="fa-IR" w:eastAsia="fa-IR"/>
-              </w:rPr>
-              <w:t>physics_based</w:t>
             </w:r>
           </w:p>
         </w:tc>
         <w:tc>
           <w:tcPr>
-            <w:tcW w:type="dxa" w:w="3364"/>
+            <w:tcW w:type="dxa" w:w="2800"/>
             <w:shd w:fill="F7F7F7" w:val="clear"/>
             <w:tcBorders>
               <w:top w:val="single" w:sz="4" w:color="4A4A4A"/>
@@ -2911,7 +3013,7 @@
               <w:bidi w:val="1"/>
             </w:pPr>
             <w:r>
-              <w:t>بله؛ سطح نردبان همچنان ۰</w:t>
+              <w:t>بله؛ درجهٔ حسابرس ۰</w:t>
             </w:r>
             <w:r>
               <w:rPr>
@@ -2926,7 +3028,7 @@
         </w:tc>
         <w:tc>
           <w:tcPr>
-            <w:tcW w:type="dxa" w:w="3364"/>
+            <w:tcW w:type="dxa" w:w="2592"/>
             <w:shd w:fill="F7F7F7" w:val="clear"/>
             <w:tcBorders>
               <w:top w:val="single" w:sz="4" w:color="4A4A4A"/>
@@ -2942,7 +3044,7 @@
               <w:bidi w:val="1"/>
             </w:pPr>
             <w:r>
-              <w:t>اجرایی</w:t>
+              <w:t>برچسب</w:t>
             </w:r>
             <w:r>
               <w:rPr>
@@ -3003,7 +3105,7 @@
           <w:rtl w:val="1"/>
           <w:lang w:val="en-US" w:bidi="fa-IR" w:eastAsia="fa-IR"/>
         </w:rPr>
-        <w:t>HE01 کنترل مثبت است: کمپینی اجراشده و بازپخش‌پذیر، با مداخله و سی بذر جفتی. درمان با کنترل‌های محتوای تهی، کانال بسته، کانال روشن بدون این سوگیری، و محتوای برخورده مقایسه می‌شود. سنجه میانگین انرژی پایانی گیرنده داخل شبیه‌سازی است. برچسب داخل فایل results_v7.json برابر intervention_supported است. حسابرس عمومی همان بسته را در سطح ۴ می‌گذارد؛ تا سطح ۵ فقط شناسهٔ آرشیو کم است. این نام روی نقشهٔ داخلی کنار سطح ۳ است و به‌تنهایی درجه را نمی‌سازد.</w:t>
+        <w:t>HE01 کنترل مثبت است: کمپین اجراشده و بازپخش‌پذیر، با مداخله و سی بذر جفتی. درمان با چهار کنترل مقایسه می‌شود: محتوای تهی، کانال بسته، کانال روشن بدون این سوگیری، و محتوای برخورده. سنجه میانگین انرژی پایانی گیرنده در شبیه‌سازی است. حسابرس همین بسته را در سطح ۴ می‌گذارد. برچسب فایل results_v7.json برابر intervention_supported است و درجهٔ حسابرس ۴ است.</w:t>
       </w:r>
     </w:p>
     <w:p>
@@ -3018,7 +3120,7 @@
           <w:rtl w:val="1"/>
           <w:lang w:val="en-US" w:bidi="fa-IR" w:eastAsia="fa-IR"/>
         </w:rPr>
-        <w:t>فایل results_v7.json با پیشوند اثرانگشت 28f812c5 سه مقایسهٔ جفتی دارد [16]. نسبت به کانال روشن و بدون سوگیری منشأ، اختلاف ۱۶٫۴۹ واحد است. p خام جایگشت ۴٫۹۹۹۷۵×۱۰⁻⁵ و p پس از Holm برابر ۱٫۵۰×۱۰⁻⁴ است. بازهٔ BCa نیز [۱۴٫۲۵، ۱۹٫۱۴] است. نسبت به کانال بسته و محتوای تهی، اختلاف ۳۰٫۶۷ واحد و بازهٔ [۲۶٫۰۳، ۳۵٫۳۲] است. در مقایسهٔ اول کانال سر جای خود می‌ماند و فقط سوگیری برداشته می‌شود. در مقایسهٔ دوم هم محتوا عوض می‌شود و هم سوگیری. اگر همان سی اختلاف را با بوت‌استرپ studentized، که اختیاری است، دوباره حساب کنیم، بازه حدود ۱۴٫۰۵ تا ۱۹٫۳۰ می‌شود. این تفاوت از روش می‌آید و فایل v7 دست نخورده است.</w:t>
+        <w:t>فایل results_v7.json با پیشوند اثرانگشت 28f812c5 سه مقایسهٔ جفتی دارد [16]. نسبت به کانال روشن و بدون سوگیری منشأ، اختلاف ۱۶٫۴۹ واحد است. کران پایین بازه ۱۴٫۲۵ و کران بالا ۱۹٫۱۴ است. p خام 4.99975e-5 و p پس از Holm برابر 1.50e-4 است. نسبت به کانال بسته و محتوای تهی، اختلاف ۳۰٫۶۷ واحد است، با کران پایین ۲۶٫۰۳ و کران بالا ۳۵٫۳۲. در مقایسهٔ اول فقط سوگیری برداشته می‌شود. در مقایسهٔ دوم هم محتوا عوض می‌شود و هم سوگیری. بازهٔ اختیاری studentized حدود ۱۴٫۰۵ تا ۱۹٫۳۰ است و فایل v7 دست نمی‌خورد.</w:t>
       </w:r>
     </w:p>
     <w:p>
@@ -3111,6 +3213,9 @@
         <w:gridCol w:w="5046"/>
       </w:tblGrid>
       <w:tr>
+        <w:trPr>
+          <w:cantSplit/>
+        </w:trPr>
         <w:tc>
           <w:tcPr>
             <w:tcW w:type="dxa" w:w="5046"/>
@@ -3175,6 +3280,9 @@
         </w:tc>
       </w:tr>
       <w:tr>
+        <w:trPr>
+          <w:cantSplit/>
+        </w:trPr>
         <w:tc>
           <w:tcPr>
             <w:tcW w:type="dxa" w:w="5046"/>
@@ -3237,6 +3345,9 @@
         </w:tc>
       </w:tr>
       <w:tr>
+        <w:trPr>
+          <w:cantSplit/>
+        </w:trPr>
         <w:tc>
           <w:tcPr>
             <w:tcW w:type="dxa" w:w="5046"/>
@@ -3299,6 +3410,9 @@
         </w:tc>
       </w:tr>
       <w:tr>
+        <w:trPr>
+          <w:cantSplit/>
+        </w:trPr>
         <w:tc>
           <w:tcPr>
             <w:tcW w:type="dxa" w:w="5046"/>
@@ -3314,9 +3428,16 @@
           <w:p>
             <w:pPr>
               <w:jc w:val="center"/>
-              <w:bidi w:val="1"/>
+              <w:bidi w:val="0"/>
             </w:pPr>
-            <w:r/>
+            <w:r>
+              <w:rPr>
+                <w:sz w:val="16"/>
+                <w:szCs w:val="16"/>
+                <w:rFonts w:ascii="Calibri" w:hAnsi="Calibri" w:cs="Calibri"/>
+              </w:rPr>
+              <w:t>source_bias_on vs source_bias_off</w:t>
+            </w:r>
             <w:r>
               <w:rPr>
                 <w:rFonts w:ascii="Times New Roman" w:hAnsi="Times New Roman" w:cs="B Nazanin" w:eastAsia="B Nazanin"/>
@@ -3325,7 +3446,6 @@
                 <w:rtl w:val="1"/>
                 <w:lang w:val="en-US" w:bidi="fa-IR" w:eastAsia="fa-IR"/>
               </w:rPr>
-              <w:t>source_bias_on در برابر source_bias_off</w:t>
             </w:r>
           </w:p>
         </w:tc>
@@ -3347,12 +3467,20 @@
               <w:bidi w:val="0"/>
             </w:pPr>
             <w:r>
-              <w:t>Δ = ۱۶٫۴۹ ؛ BCa [۱۴٫۲۵، ۱۹٫۱۴]</w:t>
+              <w:rPr>
+                <w:sz w:val="16"/>
+                <w:szCs w:val="16"/>
+                <w:rFonts w:ascii="Calibri" w:hAnsi="Calibri" w:cs="Calibri"/>
+              </w:rPr>
+              <w:t>16.49; BCa [14.25, 19.14]</w:t>
             </w:r>
           </w:p>
         </w:tc>
       </w:tr>
       <w:tr>
+        <w:trPr>
+          <w:cantSplit/>
+        </w:trPr>
         <w:tc>
           <w:tcPr>
             <w:tcW w:type="dxa" w:w="5046"/>
@@ -3368,10 +3496,15 @@
           <w:p>
             <w:pPr>
               <w:jc w:val="center"/>
-              <w:bidi w:val="1"/>
+              <w:bidi w:val="0"/>
             </w:pPr>
             <w:r>
-              <w:t>source_bias_on در برابر capsules_off / content_null</w:t>
+              <w:rPr>
+                <w:sz w:val="16"/>
+                <w:szCs w:val="16"/>
+                <w:rFonts w:ascii="Calibri" w:hAnsi="Calibri" w:cs="Calibri"/>
+              </w:rPr>
+              <w:t>source_bias_on vs capsules_off</w:t>
             </w:r>
           </w:p>
         </w:tc>
@@ -3393,12 +3526,20 @@
               <w:bidi w:val="0"/>
             </w:pPr>
             <w:r>
-              <w:t>Δ = ۳۰٫۶۷ ؛ BCa [۲۶٫۰۳، ۳۵٫۳۲]</w:t>
+              <w:rPr>
+                <w:sz w:val="16"/>
+                <w:szCs w:val="16"/>
+                <w:rFonts w:ascii="Calibri" w:hAnsi="Calibri" w:cs="Calibri"/>
+              </w:rPr>
+              <w:t>30.67; BCa [26.03, 35.32]</w:t>
             </w:r>
           </w:p>
         </w:tc>
       </w:tr>
       <w:tr>
+        <w:trPr>
+          <w:cantSplit/>
+        </w:trPr>
         <w:tc>
           <w:tcPr>
             <w:tcW w:type="dxa" w:w="5046"/>
@@ -3446,7 +3587,14 @@
               <w:jc w:val="center"/>
               <w:bidi w:val="0"/>
             </w:pPr>
-            <w:r/>
+            <w:r>
+              <w:rPr>
+                <w:sz w:val="16"/>
+                <w:szCs w:val="16"/>
+                <w:rFonts w:ascii="Calibri" w:hAnsi="Calibri" w:cs="Calibri"/>
+              </w:rPr>
+              <w:t>4.99975e-5 / 1.50e-4</w:t>
+            </w:r>
             <w:r>
               <w:rPr>
                 <w:rFonts w:ascii="Times New Roman" w:hAnsi="Times New Roman" w:cs="B Nazanin" w:eastAsia="B Nazanin"/>
@@ -3455,12 +3603,14 @@
                 <w:rtl w:val="1"/>
                 <w:lang w:val="en-US" w:bidi="fa-IR" w:eastAsia="fa-IR"/>
               </w:rPr>
-              <w:t>۴٫۹۹۹۷۵×۱۰⁻⁵ / ۱٫۵۰×۱۰⁻⁴</w:t>
             </w:r>
           </w:p>
         </w:tc>
       </w:tr>
       <w:tr>
+        <w:trPr>
+          <w:cantSplit/>
+        </w:trPr>
         <w:tc>
           <w:tcPr>
             <w:tcW w:type="dxa" w:w="5046"/>
@@ -3487,7 +3637,7 @@
                 <w:rtl w:val="1"/>
                 <w:lang w:val="en-US" w:bidi="fa-IR" w:eastAsia="fa-IR"/>
               </w:rPr>
-              <w:t>سقف ادعا در مصنوع</w:t>
+              <w:t>درجهٔ حسابرس</w:t>
             </w:r>
           </w:p>
         </w:tc>
@@ -3506,9 +3656,16 @@
           <w:p>
             <w:pPr>
               <w:jc w:val="center"/>
-              <w:bidi w:val="1"/>
+              <w:bidi w:val="0"/>
             </w:pPr>
-            <w:r/>
+            <w:r>
+              <w:rPr>
+                <w:sz w:val="16"/>
+                <w:szCs w:val="16"/>
+                <w:rFonts w:ascii="Calibri" w:hAnsi="Calibri" w:cs="Calibri"/>
+              </w:rPr>
+              <w:t>4</w:t>
+            </w:r>
             <w:r>
               <w:rPr>
                 <w:rFonts w:ascii="Times New Roman" w:hAnsi="Times New Roman" w:cs="B Nazanin" w:eastAsia="B Nazanin"/>
@@ -3517,12 +3674,14 @@
                 <w:rtl w:val="1"/>
                 <w:lang w:val="en-US" w:bidi="fa-IR" w:eastAsia="fa-IR"/>
               </w:rPr>
-              <w:t>intervention_supported</w:t>
             </w:r>
           </w:p>
         </w:tc>
       </w:tr>
       <w:tr>
+        <w:trPr>
+          <w:cantSplit/>
+        </w:trPr>
         <w:tc>
           <w:tcPr>
             <w:tcW w:type="dxa" w:w="5046"/>

</xml_diff>